<commit_message>
refactor(blog): figures 파일명을 본문 등장 순서 번호로 통일 (04_cina 제외)
업로드 순서와 파일명이 일치하도록 01.png, 02.png … 로 변경.
탐색기 이름순 정렬이 곧 업로드 순서가 되게 두 자리로 패딩
(한 자리면 1, 10, 11, 2 … 로 섞임)
- 01 10장 / 02·03·05·09 12장 / 10 8장, 참조 누락 0건 검증
- 본문 미사용 그림 140개는 삭제하지 않고 figures/_미사용/ 으로 이동
- 04_cina는 지시대로 원래 파일명 유지
- _build/rename_figures.py 추가: 그림 추가·교체 후 번호 재정렬 재실행용
- 그림_업로드순서.txt에 캡션 앞부분을 함께 적어 대조표로 사용

Co-Authored-By: Claude Opus 4.8 <noreply@anthropic.com>
</commit_message>
<xml_diff>
--- a/blog/03_soop-starter/03_soop-starter.docx
+++ b/blog/03_soop-starter/03_soop-starter.docx
@@ -252,7 +252,7 @@
               <a:graphicData uri="http://schemas.openxmlformats.org/drawingml/2006/picture">
                 <pic:pic>
                   <pic:nvPicPr>
-                    <pic:cNvPr id="0" name="live01_home.png"/>
+                    <pic:cNvPr id="0" name="01.png"/>
                     <pic:cNvPicPr/>
                   </pic:nvPicPr>
                   <pic:blipFill>
@@ -628,7 +628,7 @@
               <a:graphicData uri="http://schemas.openxmlformats.org/drawingml/2006/picture">
                 <pic:pic>
                   <pic:nvPicPr>
-                    <pic:cNvPr id="0" name="p03.png"/>
+                    <pic:cNvPr id="0" name="02.png"/>
                     <pic:cNvPicPr/>
                   </pic:nvPicPr>
                   <pic:blipFill>
@@ -939,7 +939,7 @@
               <a:graphicData uri="http://schemas.openxmlformats.org/drawingml/2006/picture">
                 <pic:pic>
                   <pic:nvPicPr>
-                    <pic:cNvPr id="0" name="p04.png"/>
+                    <pic:cNvPr id="0" name="03.png"/>
                     <pic:cNvPicPr/>
                   </pic:nvPicPr>
                   <pic:blipFill>
@@ -1034,7 +1034,7 @@
               <a:graphicData uri="http://schemas.openxmlformats.org/drawingml/2006/picture">
                 <pic:pic>
                   <pic:nvPicPr>
-                    <pic:cNvPr id="0" name="p05.png"/>
+                    <pic:cNvPr id="0" name="04.png"/>
                     <pic:cNvPicPr/>
                   </pic:nvPicPr>
                   <pic:blipFill>
@@ -1225,7 +1225,7 @@
               <a:graphicData uri="http://schemas.openxmlformats.org/drawingml/2006/picture">
                 <pic:pic>
                   <pic:nvPicPr>
-                    <pic:cNvPr id="0" name="r2_per_product.png"/>
+                    <pic:cNvPr id="0" name="05.png"/>
                     <pic:cNvPicPr/>
                   </pic:nvPicPr>
                   <pic:blipFill>
@@ -1368,7 +1368,7 @@
               <a:graphicData uri="http://schemas.openxmlformats.org/drawingml/2006/picture">
                 <pic:pic>
                   <pic:nvPicPr>
-                    <pic:cNvPr id="0" name="shap_summary_pyogo.png"/>
+                    <pic:cNvPr id="0" name="06.png"/>
                     <pic:cNvPicPr/>
                   </pic:nvPicPr>
                   <pic:blipFill>
@@ -1583,7 +1583,7 @@
               <a:graphicData uri="http://schemas.openxmlformats.org/drawingml/2006/picture">
                 <pic:pic>
                   <pic:nvPicPr>
-                    <pic:cNvPr id="0" name="tsne_node2vec.png"/>
+                    <pic:cNvPr id="0" name="07.png"/>
                     <pic:cNvPicPr/>
                   </pic:nvPicPr>
                   <pic:blipFill>
@@ -1678,7 +1678,7 @@
               <a:graphicData uri="http://schemas.openxmlformats.org/drawingml/2006/picture">
                 <pic:pic>
                   <pic:nvPicPr>
-                    <pic:cNvPr id="0" name="precision_at_k.png"/>
+                    <pic:cNvPr id="0" name="08.png"/>
                     <pic:cNvPicPr/>
                   </pic:nvPicPr>
                   <pic:blipFill>
@@ -1869,7 +1869,7 @@
               <a:graphicData uri="http://schemas.openxmlformats.org/drawingml/2006/picture">
                 <pic:pic>
                   <pic:nvPicPr>
-                    <pic:cNvPr id="0" name="fan_chart_p-01.png"/>
+                    <pic:cNvPr id="0" name="09.png"/>
                     <pic:cNvPicPr/>
                   </pic:nvPicPr>
                   <pic:blipFill>
@@ -2012,7 +2012,7 @@
               <a:graphicData uri="http://schemas.openxmlformats.org/drawingml/2006/picture">
                 <pic:pic>
                   <pic:nvPicPr>
-                    <pic:cNvPr id="0" name="calibration_mape.png"/>
+                    <pic:cNvPr id="0" name="10.png"/>
                     <pic:cNvPicPr/>
                   </pic:nvPicPr>
                   <pic:blipFill>
@@ -2302,7 +2302,7 @@
               <a:graphicData uri="http://schemas.openxmlformats.org/drawingml/2006/picture">
                 <pic:pic>
                   <pic:nvPicPr>
-                    <pic:cNvPr id="0" name="p07.png"/>
+                    <pic:cNvPr id="0" name="11.png"/>
                     <pic:cNvPicPr/>
                   </pic:nvPicPr>
                   <pic:blipFill>
@@ -2517,7 +2517,7 @@
               <a:graphicData uri="http://schemas.openxmlformats.org/drawingml/2006/picture">
                 <pic:pic>
                   <pic:nvPicPr>
-                    <pic:cNvPr id="0" name="latency_chart.png"/>
+                    <pic:cNvPr id="0" name="12.png"/>
                     <pic:cNvPicPr/>
                   </pic:nvPicPr>
                   <pic:blipFill>

</xml_diff>